<commit_message>
Update practice docs and register page
</commit_message>
<xml_diff>
--- a/docs/Отзыв руководителя .docx
+++ b/docs/Отзыв руководителя .docx
@@ -39,13 +39,8 @@
         <w:jc w:val="both"/>
       </w:pPr>
       <w:r>
-        <w:t xml:space="preserve">Вид практики: </w:t>
-      </w:r>
-      <w:proofErr w:type="gramStart"/>
-      <w:r>
-        <w:t>Учебная  практика</w:t>
-      </w:r>
-      <w:proofErr w:type="gramEnd"/>
+        <w:t>Вид практики: Учебная  практика</w:t>
+      </w:r>
     </w:p>
     <w:p>
       <w:pPr>
@@ -99,15 +94,7 @@
       <w:bookmarkStart w:id="0" w:name="_heading=h.yli8ti3xhfgz" w:colFirst="0" w:colLast="0"/>
       <w:bookmarkEnd w:id="0"/>
       <w:r>
-        <w:t xml:space="preserve">с </w:t>
-      </w:r>
-      <w:proofErr w:type="gramStart"/>
-      <w:r>
-        <w:t>29.06.2026  по</w:t>
-      </w:r>
-      <w:proofErr w:type="gramEnd"/>
-      <w:r>
-        <w:t xml:space="preserve"> 12.07.2026</w:t>
+        <w:t>с 29.06.2026  по 12.07.2026</w:t>
       </w:r>
     </w:p>
     <w:p>
@@ -158,38 +145,60 @@
         <w:rPr>
           <w:u w:val="single"/>
         </w:rPr>
-        <w:t>____________________________________________________________________________________________________________________________________________________________________________________________________________________________________________________________________________________________________________________</w:t>
-      </w:r>
-    </w:p>
-    <w:p>
-      <w:pPr>
-        <w:spacing w:line="360" w:lineRule="auto"/>
+        <w:t xml:space="preserve">изучил структуру веб-приложения, участвовал в разработке и доработке пользовательского интерфейса, реализовывал страницы личного кабинета, корзины, бонусной программы и оформления заказа, работал с компонентами </w:t>
+      </w:r>
+      <w:proofErr w:type="spellStart"/>
+      <w:r>
         <w:rPr>
           <w:u w:val="single"/>
         </w:rPr>
+        <w:t>React</w:t>
+      </w:r>
+      <w:proofErr w:type="spellEnd"/>
+      <w:r>
+        <w:rPr>
+          <w:u w:val="single"/>
+        </w:rPr>
+        <w:t>/Next.js, стилями SCSS, обработкой пользовательских данных и отображением товарных вариантов</w:t>
+      </w:r>
+    </w:p>
+    <w:p>
+      <w:pPr>
+        <w:spacing w:line="360" w:lineRule="auto"/>
+        <w:rPr>
+          <w:lang w:val="ru-RU"/>
+        </w:rPr>
       </w:pPr>
       <w:r>
         <w:t xml:space="preserve">В период практики студент </w:t>
       </w:r>
-      <w:r>
+    </w:p>
+    <w:p>
+      <w:pPr>
+        <w:spacing w:line="360" w:lineRule="auto"/>
         <w:rPr>
           <w:u w:val="single"/>
         </w:rPr>
-        <w:t>_________________________________________________________________________________________________________________________________________________________________________________________________________________________________________________________________________________________________________________________________________________________________________________________________</w:t>
-      </w:r>
-    </w:p>
-    <w:p>
-      <w:pPr>
-        <w:spacing w:line="360" w:lineRule="auto"/>
+      </w:pPr>
+      <w:r>
         <w:rPr>
           <w:u w:val="single"/>
         </w:rPr>
-      </w:pPr>
+        <w:t xml:space="preserve">проявил хороший уровень теоретической подготовки, внимательность к деталям и ответственное отношение к поставленным задачам. Мирошниченко Егор Юрьевич показал умение разбираться в существующем коде, применять современные инструменты </w:t>
+      </w:r>
+      <w:proofErr w:type="spellStart"/>
       <w:r>
         <w:rPr>
           <w:u w:val="single"/>
         </w:rPr>
-        <w:t>_____________________________________________________________________________</w:t>
+        <w:t>frontend</w:t>
+      </w:r>
+      <w:proofErr w:type="spellEnd"/>
+      <w:r>
+        <w:rPr>
+          <w:u w:val="single"/>
+        </w:rPr>
+        <w:t>-разработки, аккуратно вносить изменения и проверять результат работы. К выполнению заданий относился добросовестно, соблюдал сроки, проявлял самостоятельность и заинтересованность в повышении качества разрабатываемого программного продукта</w:t>
       </w:r>
     </w:p>
     <w:p>
@@ -855,7 +864,6 @@
   <w:style w:type="character" w:default="1" w:styleId="a0">
     <w:name w:val="Default Paragraph Font"/>
     <w:uiPriority w:val="1"/>
-    <w:semiHidden/>
     <w:unhideWhenUsed/>
   </w:style>
   <w:style w:type="table" w:default="1" w:styleId="a1">

</xml_diff>